<commit_message>
Add switching-cgs architecture findings, PGC/CMS, and channel-layer grouping
Explore the switching-cgs Go microservices project and confirm, with
real code evidence, that it connects directly to the same Oracle
schemas as core/enterprise (no API layer) — strengthening the earlier
business-only claim about Payment Switching. Add a new cgs-pos section
2.5 documenting this third application (BL2/gRPC protocols, Redis
job-queue, direct-DB access shared with QRIS/jalin), and cross-link it
from the QRIS and Payment Switching sections. Add a new section/diagram
covering two more surrounding systems found in switching-cgs config:
API KTP (identity verification) and SMS API (OTP).

Rename the "Bansos" government-disbursement topic to PGC (Pos Giro
Cash) per business terminology, renaming the diagram file accordingly.

Also apply a "Channel Layer" grouping box around the top channel row
in both the cgs-pos and master architecture diagrams (01) for clearer
visual grouping.
</commit_message>
<xml_diff>
--- a/deployments/cgs-pos/dist/materi_training_ibankcore.docx
+++ b/deployments/cgs-pos/dist/materi_training_ibankcore.docx
@@ -776,6 +776,143 @@
     </w:p>
     <w:p>
       <w:pPr>
+        <w:pStyle w:val="Heading2"/>
+        <w:spacing w:after="120" w:before="260"/>
+      </w:pPr>
+      <w:r>
+        <w:t xml:space="preserve">2.5 Aplikasi Ketiga: Switching (switching-cgs)</w:t>
+      </w:r>
+    </w:p>
+    <w:p>
+      <w:pPr>
+        <w:spacing w:after="160" w:line="300"/>
+      </w:pPr>
+      <w:r>
+        <w:t xml:space="preserve">Selain core dan enterprise (Bagian 2.4), pada deployment PT Pos terdapat </w:t>
+      </w:r>
+      <w:r>
+        <w:rPr>
+          <w:b/>
+          <w:bCs/>
+        </w:rPr>
+        <w:t xml:space="preserve">aplikasi ketiga yang berdiri sendiri</w:t>
+      </w:r>
+      <w:r>
+        <w:t xml:space="preserve">: proyek switching (nama internal "switching-cgs") — hasil modernisasi komponen switching pembayaran dari Python legacy ke </w:t>
+      </w:r>
+      <w:r>
+        <w:rPr>
+          <w:b/>
+          <w:bCs/>
+        </w:rPr>
+        <w:t xml:space="preserve">Go</w:t>
+      </w:r>
+      <w:r>
+        <w:t xml:space="preserve">.</w:t>
+      </w:r>
+    </w:p>
+    <w:p>
+      <w:pPr>
+        <w:pStyle w:val="ListParagraph"/>
+        <w:numPr>
+          <w:ilvl w:val="0"/>
+          <w:numId w:val="2"/>
+        </w:numPr>
+        <w:spacing w:after="80"/>
+      </w:pPr>
+      <w:r>
+        <w:rPr>
+          <w:b/>
+          <w:bCs/>
+        </w:rPr>
+        <w:t xml:space="preserve">Arsitektur microservice</w:t>
+      </w:r>
+      <w:r>
+        <w:t xml:space="preserve"> — terdiri dari beberapa service terpisah (mis. core, core-hin, core-inq, core-rev, bca, jalin/QRIS, topup), masing-masing mendukung dua protokol: </w:t>
+      </w:r>
+      <w:r>
+        <w:rPr>
+          <w:b/>
+          <w:bCs/>
+        </w:rPr>
+        <w:t xml:space="preserve">BL2 (TCP)</w:t>
+      </w:r>
+      <w:r>
+        <w:t xml:space="preserve"> untuk kompatibilitas ATM/EDC legacy, dan </w:t>
+      </w:r>
+      <w:r>
+        <w:rPr>
+          <w:b/>
+          <w:bCs/>
+        </w:rPr>
+        <w:t xml:space="preserve">gRPC</w:t>
+      </w:r>
+      <w:r>
+        <w:t xml:space="preserve"> untuk klien modern. </w:t>
+      </w:r>
+      <w:r>
+        <w:rPr>
+          <w:b/>
+          <w:bCs/>
+        </w:rPr>
+        <w:t xml:space="preserve">Redis</w:t>
+      </w:r>
+      <w:r>
+        <w:t xml:space="preserve"> dipakai sebagai job-queue/state-tracking untuk idempotency &amp; recovery, dideploy via Docker/Kubernetes.</w:t>
+      </w:r>
+    </w:p>
+    <w:p>
+      <w:pPr>
+        <w:pStyle w:val="ListParagraph"/>
+        <w:numPr>
+          <w:ilvl w:val="0"/>
+          <w:numId w:val="2"/>
+        </w:numPr>
+        <w:spacing w:after="80"/>
+      </w:pPr>
+      <w:r>
+        <w:rPr>
+          <w:b/>
+          <w:bCs/>
+        </w:rPr>
+        <w:t xml:space="preserve">Akses langsung ke database Core</w:t>
+      </w:r>
+      <w:r>
+        <w:t xml:space="preserve"> — berbeda dari core/enterprise yang mengakses data melalui lapisan aplikasinya sendiri, switching-cgs terhubung </w:t>
+      </w:r>
+      <w:r>
+        <w:rPr>
+          <w:b/>
+          <w:bCs/>
+        </w:rPr>
+        <w:t xml:space="preserve">langsung ke Oracle</w:t>
+      </w:r>
+      <w:r>
+        <w:t xml:space="preserve"> dengan skema (`ibcoreprod`/`ibentprod`) yang sama persis dengan skema core/enterprise, lengkap dengan modul query per-tabel (akun, transaksi, CIF, dsb.) — bukan lewat API. Pola ini konsisten dipakai baik untuk switching pembayaran umum (Bagian 7.5) maupun QRIS (menggantikan/melengkapi implementasi QRIS sisi core, Bagian 7.2), serta integrasi verifikasi identitas &amp; OTP (Bagian 7.7).</w:t>
+      </w:r>
+    </w:p>
+    <w:p>
+      <w:pPr>
+        <w:pStyle w:val="ListParagraph"/>
+        <w:numPr>
+          <w:ilvl w:val="0"/>
+          <w:numId w:val="2"/>
+        </w:numPr>
+        <w:spacing w:after="80"/>
+      </w:pPr>
+      <w:r>
+        <w:rPr>
+          <w:b/>
+          <w:bCs/>
+        </w:rPr>
+        <w:t xml:space="preserve">Implikasi arsitektur</w:t>
+      </w:r>
+      <w:r>
+        <w:t xml:space="preserve"> — dengan tiga aplikasi (core, enterprise, switching-cgs) yang saling terhubung ke satu database Oracle yang sama, perubahan skema database berdampak lintas aplikasi dan perlu dikoordinasikan, tidak cukup diuji di satu aplikasi saja.</w:t>
+      </w:r>
+    </w:p>
+    <w:p>
+      <w:pPr>
         <w:pStyle w:val="Heading1"/>
         <w:spacing w:after="160" w:before="360"/>
       </w:pPr>
@@ -2031,7 +2168,7 @@
         <w:t xml:space="preserve">QRIS</w:t>
       </w:r>
       <w:r>
-        <w:t xml:space="preserve"> — kanal pembayaran berbasis kode QR standar nasional; transaksi QRIS masuk melalui integrasi channel pihak ketiga dan diselesaikan (settlement) ke rekening tujuan melalui proses tersendiri.</w:t>
+        <w:t xml:space="preserve"> — kanal pembayaran berbasis kode QR standar nasional; transaksi QRIS masuk melalui integrasi channel pihak ketiga dan diselesaikan (settlement) ke rekening tujuan melalui proses tersendiri. Pemrosesan QRIS ditangani oleh service `jalin` pada aplikasi switching-cgs (Bagian 2.5), dengan pola akses langsung ke database Core yang sama seperti switching pembayaran lainnya.</w:t>
       </w:r>
     </w:p>
     <w:p>
@@ -2086,6 +2223,263 @@
       </w:pPr>
       <w:r>
         <w:t xml:space="preserve">Untuk kebutuhan konsolidasi keuangan pada level korporasi/holding, posting akuntansi diambil (pull) secara batch oleh mekanisme Feeder SAP langsung dari basis data Core, sebagai pelengkap pencatatan GL internal pada modul Accounting. Pendekatan ini berbeda dari pola push/event-driven — sistem Core tidak secara aktif mengirim data, melainkan Feeder SAP yang menjalankan proses ekstraksi terjadwal terhadap database.</w:t>
+      </w:r>
+    </w:p>
+    <w:p>
+      <w:pPr>
+        <w:pStyle w:val="Heading2"/>
+        <w:spacing w:after="120" w:before="260"/>
+      </w:pPr>
+      <w:r>
+        <w:t xml:space="preserve">7.5 Payment Switching</w:t>
+      </w:r>
+    </w:p>
+    <w:p>
+      <w:pPr>
+        <w:spacing w:after="160" w:line="300"/>
+      </w:pPr>
+      <w:r>
+        <w:t xml:space="preserve">Payment Switching (switching pembayaran antar kanal/ATM-EDC) ditangani oleh aplikasi switching-cgs (Bagian 2.5) dan memiliki </w:t>
+      </w:r>
+      <w:r>
+        <w:rPr>
+          <w:b/>
+          <w:bCs/>
+        </w:rPr>
+        <w:t xml:space="preserve">akses langsung ke basis data Core</w:t>
+      </w:r>
+      <w:r>
+        <w:t xml:space="preserve"> — bukan melalui lapisan aplikasi/API seperti kanal-kanal lain (host-to-host, REST API di atas). Ini merupakan konfigurasi pada level infrastruktur/database (mis. database link), bukan bagian dari kode aplikasi Core itu sendiri.</w:t>
+      </w:r>
+    </w:p>
+    <w:p>
+      <w:pPr>
+        <w:spacing w:after="160" w:line="300"/>
+      </w:pPr>
+      <w:r>
+        <w:t xml:space="preserve">&gt; </w:t>
+      </w:r>
+      <w:r>
+        <w:rPr>
+          <w:b/>
+          <w:bCs/>
+        </w:rPr>
+        <w:t xml:space="preserve">Catatan</w:t>
+      </w:r>
+      <w:r>
+        <w:t xml:space="preserve">: pola integrasi ini serupa dengan Feeder SAP (akses langsung ke database, bukan lewat API), namun perlu diperlakukan dengan perhatian ekstra dari sisi keamanan &amp; tata kelola data karena melewati lapisan validasi aplikasi Core — perubahan skema database di masa depan berpotensi berdampak langsung ke switching tanpa melalui kontrak API yang terversi.</w:t>
+      </w:r>
+    </w:p>
+    <w:p>
+      <w:pPr>
+        <w:pStyle w:val="Heading2"/>
+        <w:spacing w:after="120" w:before="260"/>
+      </w:pPr>
+      <w:r>
+        <w:t xml:space="preserve">7.6 Sistem Sekitar Khusus PT Pos: PGC &amp; CMS</w:t>
+      </w:r>
+    </w:p>
+    <w:p>
+      <w:pPr>
+        <w:spacing w:after="160" w:line="300"/>
+      </w:pPr>
+      <w:r>
+        <w:t xml:space="preserve">Di luar sistem sekitar generik yang telah dibahas, deployment PT Pos memiliki dua interaksi tambahan yang khas dengan perannya sebagai agen penyalur dana bantuan/tunai.</w:t>
+      </w:r>
+    </w:p>
+    <w:p>
+      <w:pPr>
+        <w:spacing w:after="160" w:line="300"/>
+      </w:pPr>
+      <w:r>
+        <w:t xml:space="preserve">&gt; </w:t>
+      </w:r>
+      <w:r>
+        <w:rPr>
+          <w:b/>
+          <w:bCs/>
+        </w:rPr>
+        <w:t xml:space="preserve">Catatan</w:t>
+      </w:r>
+      <w:r>
+        <w:t xml:space="preserve">: bagian ini disusun berdasarkan konfirmasi bisnis langsung — modul PGC dan CMS tidak ditemukan pada eksplorasi source code `core`/`enterprise` yang tersedia untuk sesi ini, sehingga detail implementasinya belum terverifikasi ke kode.</w:t>
+      </w:r>
+    </w:p>
+    <w:p>
+      <w:pPr>
+        <w:pStyle w:val="ListParagraph"/>
+        <w:numPr>
+          <w:ilvl w:val="0"/>
+          <w:numId w:val="2"/>
+        </w:numPr>
+        <w:spacing w:after="80"/>
+      </w:pPr>
+      <w:r>
+        <w:rPr>
+          <w:b/>
+          <w:bCs/>
+        </w:rPr>
+        <w:t xml:space="preserve">CMS (Cash Management System)</w:t>
+      </w:r>
+      <w:r>
+        <w:t xml:space="preserve"> — portal digital bagi nasabah korporat/institusi (termasuk instansi pemerintah/himbara penyalur PGC) untuk mengirim instruksi pembayaran/penyaluran massal (bulk disbursement) serta memantau statusnya, tanpa transaksi manual satu per satu di cabang. CMS ini </w:t>
+      </w:r>
+      <w:r>
+        <w:rPr>
+          <w:b/>
+          <w:bCs/>
+        </w:rPr>
+        <w:t xml:space="preserve">berbeda</w:t>
+      </w:r>
+      <w:r>
+        <w:t xml:space="preserve"> dari modul internal "Kas &amp; Vault" (Bagian 6) — CMS adalah kanal digital eksternal untuk institusi, bukan pengelolaan kas fisik cabang.</w:t>
+      </w:r>
+    </w:p>
+    <w:p>
+      <w:pPr>
+        <w:pStyle w:val="ListParagraph"/>
+        <w:numPr>
+          <w:ilvl w:val="0"/>
+          <w:numId w:val="2"/>
+        </w:numPr>
+        <w:spacing w:after="80"/>
+      </w:pPr>
+      <w:r>
+        <w:rPr>
+          <w:b/>
+          <w:bCs/>
+        </w:rPr>
+        <w:t xml:space="preserve">PGC (Pos Giro Cash)</w:t>
+      </w:r>
+      <w:r>
+        <w:t xml:space="preserve"> — PT Pos bertindak sebagai agen penyalur dana bantuan/tunai (mis. bantuan sosial pemerintah) ke penerima manfaat. Instruksi penyaluran diterima dari instansi pemerintah/himbara (via CMS), lalu direalisasikan melalui salah satu kanal PT Pos: loket/counter (tunai), QRIS (non-tunai), atau kredit ke rekening tabungan penerima — tergantung metode pencairan yang ditetapkan program PGC terkait.</w:t>
+      </w:r>
+    </w:p>
+    <w:p>
+      <w:pPr>
+        <w:spacing w:after="80" w:before="200"/>
+        <w:jc w:val="center"/>
+      </w:pPr>
+      <w:r>
+        <w:drawing>
+          <wp:inline distT="0" distB="0" distL="0" distR="0">
+            <wp:extent cx="5334000" cy="2981325"/>
+            <wp:effectExtent t="0" r="0" b="0" l="0"/>
+            <wp:docPr id="1" name="" descr="" title=""/>
+            <wp:cNvGraphicFramePr>
+              <a:graphicFrameLocks xmlns:a="http://schemas.openxmlformats.org/drawingml/2006/main" noChangeAspect="1"/>
+            </wp:cNvGraphicFramePr>
+            <a:graphic xmlns:a="http://schemas.openxmlformats.org/drawingml/2006/main">
+              <a:graphicData uri="http://schemas.openxmlformats.org/drawingml/2006/picture">
+                <pic:pic xmlns:pic="http://schemas.openxmlformats.org/drawingml/2006/picture">
+                  <pic:nvPicPr>
+                    <pic:cNvPr id="0" name="" descr=""/>
+                    <pic:cNvPicPr>
+                      <a:picLocks noChangeAspect="1" noChangeArrowheads="1"/>
+                    </pic:cNvPicPr>
+                  </pic:nvPicPr>
+                  <pic:blipFill>
+                    <a:blip r:embed="rId13" cstate="none"/>
+                    <a:srcRect/>
+                    <a:stretch>
+                      <a:fillRect/>
+                    </a:stretch>
+                  </pic:blipFill>
+                  <pic:spPr bwMode="auto">
+                    <a:xfrm>
+                      <a:off x="0" y="0"/>
+                      <a:ext cx="5334000" cy="2981325"/>
+                    </a:xfrm>
+                    <a:prstGeom prst="rect">
+                      <a:avLst/>
+                    </a:prstGeom>
+                  </pic:spPr>
+                </pic:pic>
+              </a:graphicData>
+            </a:graphic>
+          </wp:inline>
+        </w:drawing>
+      </w:r>
+    </w:p>
+    <w:p>
+      <w:pPr>
+        <w:spacing w:after="240"/>
+        <w:jc w:val="center"/>
+      </w:pPr>
+      <w:r>
+        <w:rPr>
+          <w:i/>
+          <w:iCs/>
+          <w:color w:val="6B7280"/>
+          <w:sz w:val="18"/>
+          <w:szCs w:val="18"/>
+        </w:rPr>
+        <w:t xml:space="preserve">Gambar 7.1 — Sistem Sekitar Khusus PT Pos: PGC &amp; CMS</w:t>
+      </w:r>
+    </w:p>
+    <w:p>
+      <w:pPr>
+        <w:pStyle w:val="Heading2"/>
+        <w:spacing w:after="120" w:before="260"/>
+      </w:pPr>
+      <w:r>
+        <w:t xml:space="preserve">7.7 Verifikasi Identitas &amp; OTP: API KTP dan SMS API</w:t>
+      </w:r>
+    </w:p>
+    <w:p>
+      <w:pPr>
+        <w:spacing w:after="160" w:line="300"/>
+      </w:pPr>
+      <w:r>
+        <w:t xml:space="preserve">Aplikasi switching juga terhubung ke dua sistem verifikasi tambahan yang mendukung proses transaksi/layanan nasabah:</w:t>
+      </w:r>
+    </w:p>
+    <w:p>
+      <w:pPr>
+        <w:pStyle w:val="ListParagraph"/>
+        <w:numPr>
+          <w:ilvl w:val="0"/>
+          <w:numId w:val="2"/>
+        </w:numPr>
+        <w:spacing w:after="80"/>
+      </w:pPr>
+      <w:r>
+        <w:rPr>
+          <w:b/>
+          <w:bCs/>
+        </w:rPr>
+        <w:t xml:space="preserve">API KTP</w:t>
+      </w:r>
+      <w:r>
+        <w:t xml:space="preserve"> — layanan verifikasi identitas nasabah (validasi data kependudukan) yang dipanggil oleh aplikasi switching saat diperlukan, mis. pada proses yang mensyaratkan pengecekan identitas.</w:t>
+      </w:r>
+    </w:p>
+    <w:p>
+      <w:pPr>
+        <w:pStyle w:val="ListParagraph"/>
+        <w:numPr>
+          <w:ilvl w:val="0"/>
+          <w:numId w:val="2"/>
+        </w:numPr>
+        <w:spacing w:after="80"/>
+      </w:pPr>
+      <w:r>
+        <w:rPr>
+          <w:b/>
+          <w:bCs/>
+        </w:rPr>
+        <w:t xml:space="preserve">SMS API</w:t>
+      </w:r>
+      <w:r>
+        <w:t xml:space="preserve"> — layanan pengiriman SMS untuk kebutuhan One-Time Password (OTP), mendukung proses otentikasi transaksi yang memerlukan verifikasi tambahan di luar PIN.</w:t>
+      </w:r>
+    </w:p>
+    <w:p>
+      <w:pPr>
+        <w:spacing w:after="160" w:line="300"/>
+      </w:pPr>
+      <w:r>
+        <w:t xml:space="preserve">Kedua integrasi ini ditemukan pada konfigurasi aplikasi switching, melengkapi gambaran sistem sekitar yang berinteraksi dengan ekosistem IBANKCORE di PT Pos.</w:t>
       </w:r>
     </w:p>
     <w:p>
@@ -2138,7 +2532,7 @@
                     </pic:cNvPicPr>
                   </pic:nvPicPr>
                   <pic:blipFill>
-                    <a:blip r:embed="rId13" cstate="none"/>
+                    <a:blip r:embed="rId14" cstate="none"/>
                     <a:srcRect/>
                     <a:stretch>
                       <a:fillRect/>

</xml_diff>

<commit_message>
Move Switching-CGS inside IBANKCORE envelope; add External Systems Layer
Draw Switching-CGS as a box inside the IBANKCORE envelope (alongside
the other modules, styled gold/dashed for its direct-DB access
pattern) instead of an external surrounding system, since it is
functionally part of the IBANKCORE ecosystem per section 2.5. Document
this placement choice in the materi text.

Also add a new "External Systems Layer" band to the architecture
diagram covering Feeder SAP, Cut-off & Cleansing Service, DWH, and
Reporting Service, feeding into SAP, regulator reporting, and a
dashboard.
</commit_message>
<xml_diff>
--- a/deployments/cgs-pos/dist/materi_training_ibankcore.docx
+++ b/deployments/cgs-pos/dist/materi_training_ibankcore.docx
@@ -808,7 +808,17 @@
         <w:t xml:space="preserve">Go</w:t>
       </w:r>
       <w:r>
-        <w:t xml:space="preserve">.</w:t>
+        <w:t xml:space="preserve">. Karena secara fungsional switching-cgs adalah bagian dari ekosistem IBANKCORE (bukan sistem pihak ketiga eksternal), pada Gambar 2.1 aplikasi ini digambar </w:t>
+      </w:r>
+      <w:r>
+        <w:rPr>
+          <w:b/>
+          <w:bCs/>
+        </w:rPr>
+        <w:t xml:space="preserve">di dalam</w:t>
+      </w:r>
+      <w:r>
+        <w:t xml:space="preserve"> envelope IBANKCORE, sejajar modul lain — meski gaya visualnya tetap dibedakan (gold, garis putus-putus) untuk menandakan akses langsungnya ke database.</w:t>
       </w:r>
     </w:p>
     <w:p>

</xml_diff>

<commit_message>
Document 3rd Party Service, Internal Support Layer, and QRIS reconciliation
Add materi sections 2.6 (3rd Party Service: PGC, Jalin/QRIS, Bank) and
2.7 (Internal Support Layer: Feeder SAP, Cut-off & Cleansing Service,
DWH, Reporting Service) to explain the new architecture diagram bands,
cross-referencing existing detailed sections rather than duplicating.

Also document the QRIS reconciliation process found in core (manual
file upload from Jalin, matched against the QRIS transaction table by
RRN/date/amount/type/settle-id, producing a daily Excel recap) as part
of section 7.2, and add a corresponding slide.
</commit_message>
<xml_diff>
--- a/deployments/cgs-pos/dist/materi_training_ibankcore.docx
+++ b/deployments/cgs-pos/dist/materi_training_ibankcore.docx
@@ -295,7 +295,7 @@
       <w:r>
         <w:drawing>
           <wp:inline distT="0" distB="0" distL="0" distR="0">
-            <wp:extent cx="5334000" cy="3371850"/>
+            <wp:extent cx="5334000" cy="2733675"/>
             <wp:effectExtent t="0" r="0" b="0" l="0"/>
             <wp:docPr id="1" name="" descr="" title=""/>
             <wp:cNvGraphicFramePr>
@@ -320,7 +320,7 @@
                   <pic:spPr bwMode="auto">
                     <a:xfrm>
                       <a:off x="0" y="0"/>
-                      <a:ext cx="5334000" cy="3371850"/>
+                      <a:ext cx="5334000" cy="2733675"/>
                     </a:xfrm>
                     <a:prstGeom prst="rect">
                       <a:avLst/>
@@ -923,6 +923,254 @@
     </w:p>
     <w:p>
       <w:pPr>
+        <w:pStyle w:val="Heading2"/>
+        <w:spacing w:after="120" w:before="260"/>
+      </w:pPr>
+      <w:r>
+        <w:t xml:space="preserve">2.6 3rd Party Service</w:t>
+      </w:r>
+    </w:p>
+    <w:p>
+      <w:pPr>
+        <w:spacing w:after="160" w:line="300"/>
+      </w:pPr>
+      <w:r>
+        <w:t xml:space="preserve">Di sisi kanan Gambar 2.1, IBANKCORE terhubung ke sejumlah penyedia layanan pihak ketiga melalui satu jalur koneksi dua arah (bidirectional) — merepresentasikan bahwa integrasi ke masing-masing pihak ketiga pada akhirnya bermuara pada satu boundary yang sama di sisi IBANKCORE, meski secara teknis tiap pihak ketiga punya kontrak/protokol integrasinya sendiri.</w:t>
+      </w:r>
+    </w:p>
+    <w:p>
+      <w:pPr>
+        <w:pStyle w:val="ListParagraph"/>
+        <w:numPr>
+          <w:ilvl w:val="0"/>
+          <w:numId w:val="2"/>
+        </w:numPr>
+        <w:spacing w:after="80"/>
+      </w:pPr>
+      <w:r>
+        <w:rPr>
+          <w:b/>
+          <w:bCs/>
+        </w:rPr>
+        <w:t xml:space="preserve">PGC (Bansos)</w:t>
+      </w:r>
+      <w:r>
+        <w:t xml:space="preserve"> — instansi pemerintah/himbara penyalur PGC (lihat Bagian 7.6 untuk detail alur penyaluran &amp; peran CMS).</w:t>
+      </w:r>
+    </w:p>
+    <w:p>
+      <w:pPr>
+        <w:pStyle w:val="ListParagraph"/>
+        <w:numPr>
+          <w:ilvl w:val="0"/>
+          <w:numId w:val="2"/>
+        </w:numPr>
+        <w:spacing w:after="80"/>
+      </w:pPr>
+      <w:r>
+        <w:rPr>
+          <w:b/>
+          <w:bCs/>
+        </w:rPr>
+        <w:t xml:space="preserve">Jalin (QRIS)</w:t>
+      </w:r>
+      <w:r>
+        <w:t xml:space="preserve"> — penyedia switching QRIS; pemrosesannya ditangani oleh service `jalin` pada aplikasi switching-cgs (Bagian 2.5 &amp; 7.2), termasuk proses rekonsiliasi manual berbasis file dari Jalin (Bagian 7.2).</w:t>
+      </w:r>
+    </w:p>
+    <w:p>
+      <w:pPr>
+        <w:pStyle w:val="ListParagraph"/>
+        <w:numPr>
+          <w:ilvl w:val="0"/>
+          <w:numId w:val="2"/>
+        </w:numPr>
+        <w:spacing w:after="80"/>
+      </w:pPr>
+      <w:r>
+        <w:rPr>
+          <w:b/>
+          <w:bCs/>
+        </w:rPr>
+        <w:t xml:space="preserve">Bank</w:t>
+      </w:r>
+      <w:r>
+        <w:t xml:space="preserve"> — bank lain/mitra untuk kebutuhan transfer maupun switching antar bank.</w:t>
+      </w:r>
+    </w:p>
+    <w:p>
+      <w:pPr>
+        <w:spacing w:after="160" w:line="300"/>
+      </w:pPr>
+      <w:r>
+        <w:t xml:space="preserve">&gt; </w:t>
+      </w:r>
+      <w:r>
+        <w:rPr>
+          <w:b/>
+          <w:bCs/>
+        </w:rPr>
+        <w:t xml:space="preserve">Catatan</w:t>
+      </w:r>
+      <w:r>
+        <w:t xml:space="preserve">: pengelompokan "3rd Party Service" ini menggambarkan pihak eksternal yang sudah dibahas detailnya di bagian lain — bagian ini hanya menyatukan gambaran besarnya dalam satu diagram arsitektur.</w:t>
+      </w:r>
+    </w:p>
+    <w:p>
+      <w:pPr>
+        <w:pStyle w:val="Heading2"/>
+        <w:spacing w:after="120" w:before="260"/>
+      </w:pPr>
+      <w:r>
+        <w:t xml:space="preserve">2.7 Internal Support Layer</w:t>
+      </w:r>
+    </w:p>
+    <w:p>
+      <w:pPr>
+        <w:spacing w:after="160" w:line="300"/>
+      </w:pPr>
+      <w:r>
+        <w:t xml:space="preserve">Di bagian bawah Gambar 2.1, terdapat kumpulan layanan pendukung internal yang beroperasi di sekitar (bukan di dalam) database Core, masing-masing independen satu sama lain:</w:t>
+      </w:r>
+    </w:p>
+    <w:p>
+      <w:pPr>
+        <w:pStyle w:val="ListParagraph"/>
+        <w:numPr>
+          <w:ilvl w:val="0"/>
+          <w:numId w:val="2"/>
+        </w:numPr>
+        <w:spacing w:after="80"/>
+      </w:pPr>
+      <w:r>
+        <w:rPr>
+          <w:b/>
+          <w:bCs/>
+        </w:rPr>
+        <w:t xml:space="preserve">Feeder SAP</w:t>
+      </w:r>
+      <w:r>
+        <w:t xml:space="preserve"> — mengambil (pull) data akuntansi dari database Core untuk dikirim ke sistem SAP eksternal (detail mekanisme pull-nya di Bagian 4.3 &amp; 7.4).</w:t>
+      </w:r>
+    </w:p>
+    <w:p>
+      <w:pPr>
+        <w:pStyle w:val="ListParagraph"/>
+        <w:numPr>
+          <w:ilvl w:val="0"/>
+          <w:numId w:val="2"/>
+        </w:numPr>
+        <w:spacing w:after="80"/>
+      </w:pPr>
+      <w:r>
+        <w:rPr>
+          <w:b/>
+          <w:bCs/>
+        </w:rPr>
+        <w:t xml:space="preserve">Cut-off &amp; Cleansing Service</w:t>
+      </w:r>
+      <w:r>
+        <w:t xml:space="preserve"> — layanan yang menyiapkan/membersihkan data pada titik cut-off (mis. akhir hari), sejalan dengan proses Batch EOD/BOD yang telah dibahas (Bagian 10.1), sebelum data dikonsumsi oleh layanan hilir seperti DWH atau Reporting Service.</w:t>
+      </w:r>
+    </w:p>
+    <w:p>
+      <w:pPr>
+        <w:pStyle w:val="ListParagraph"/>
+        <w:numPr>
+          <w:ilvl w:val="0"/>
+          <w:numId w:val="2"/>
+        </w:numPr>
+        <w:spacing w:after="80"/>
+      </w:pPr>
+      <w:r>
+        <w:rPr>
+          <w:b/>
+          <w:bCs/>
+        </w:rPr>
+        <w:t xml:space="preserve">DWH (Data Warehouse)</w:t>
+      </w:r>
+      <w:r>
+        <w:t xml:space="preserve"> — gudang data yang menampung hasil olahan/agregasi data Core untuk kebutuhan analitik, menjadi sumber data bagi Dashboard.</w:t>
+      </w:r>
+    </w:p>
+    <w:p>
+      <w:pPr>
+        <w:pStyle w:val="ListParagraph"/>
+        <w:numPr>
+          <w:ilvl w:val="0"/>
+          <w:numId w:val="2"/>
+        </w:numPr>
+        <w:spacing w:after="80"/>
+      </w:pPr>
+      <w:r>
+        <w:rPr>
+          <w:b/>
+          <w:bCs/>
+        </w:rPr>
+        <w:t xml:space="preserve">Reporting Service</w:t>
+      </w:r>
+      <w:r>
+        <w:t xml:space="preserve"> — layanan yang menyusun laporan, termasuk pelaporan berkala ke regulator OJK/BI (Bagian 7.1).</w:t>
+      </w:r>
+    </w:p>
+    <w:p>
+      <w:pPr>
+        <w:spacing w:after="160" w:line="300"/>
+      </w:pPr>
+      <w:r>
+        <w:t xml:space="preserve">Keempat layanan ini bermuara ke tiga tujuan akhir: </w:t>
+      </w:r>
+      <w:r>
+        <w:rPr>
+          <w:b/>
+          <w:bCs/>
+        </w:rPr>
+        <w:t xml:space="preserve">SAP</w:t>
+      </w:r>
+      <w:r>
+        <w:t xml:space="preserve"> (dari Feeder SAP), </w:t>
+      </w:r>
+      <w:r>
+        <w:rPr>
+          <w:b/>
+          <w:bCs/>
+        </w:rPr>
+        <w:t xml:space="preserve">Regulator OJK/BI Reporting</w:t>
+      </w:r>
+      <w:r>
+        <w:t xml:space="preserve"> (dari Internal Support Layer secara umum, terutama Reporting Service), dan </w:t>
+      </w:r>
+      <w:r>
+        <w:rPr>
+          <w:b/>
+          <w:bCs/>
+        </w:rPr>
+        <w:t xml:space="preserve">Dashboard</w:t>
+      </w:r>
+      <w:r>
+        <w:t xml:space="preserve"> (dipasok dari DWH).</w:t>
+      </w:r>
+    </w:p>
+    <w:p>
+      <w:pPr>
+        <w:spacing w:after="160" w:line="300"/>
+      </w:pPr>
+      <w:r>
+        <w:t xml:space="preserve">&gt; </w:t>
+      </w:r>
+      <w:r>
+        <w:rPr>
+          <w:b/>
+          <w:bCs/>
+        </w:rPr>
+        <w:t xml:space="preserve">Catatan</w:t>
+      </w:r>
+      <w:r>
+        <w:t xml:space="preserve">: penamaan "Internal Support Layer" dipilih untuk membedakannya dari "3rd Party Service" (Bagian 2.6) — layanan-layanan ini adalah komponen pendukung milik/dikelola sendiri (internal), bukan sistem pihak ketiga eksternal, meski posisinya di luar envelope IBANKCORE pada diagram.</w:t>
+      </w:r>
+    </w:p>
+    <w:p>
+      <w:pPr>
         <w:pStyle w:val="Heading1"/>
         <w:spacing w:after="160" w:before="360"/>
       </w:pPr>
@@ -2199,6 +2447,36 @@
       </w:r>
       <w:r>
         <w:t xml:space="preserve"> — nomor rekening virtual yang dipetakan ke rekening nasabah/tujuan sebenarnya, umumnya dipakai untuk penagihan (billing) atau penerimaan pembayaran; pencocokan (matching) pembayaran VA dilakukan secara terjadwal (batch).</w:t>
+      </w:r>
+    </w:p>
+    <w:p>
+      <w:pPr>
+        <w:pStyle w:val="ListParagraph"/>
+        <w:numPr>
+          <w:ilvl w:val="0"/>
+          <w:numId w:val="2"/>
+        </w:numPr>
+        <w:spacing w:after="80"/>
+      </w:pPr>
+      <w:r>
+        <w:rPr>
+          <w:b/>
+          <w:bCs/>
+        </w:rPr>
+        <w:t xml:space="preserve">Rekonsiliasi QRIS</w:t>
+      </w:r>
+      <w:r>
+        <w:t xml:space="preserve"> — proses pencocokan data transaksi QRIS sisi Core terhadap data dari Jalin, dijalankan di sisi aplikasi `core` (bukan switching-cgs). Mekanismenya: user meng-upload file teks dari Jalin (format pipe-delimited berisi RRN, tanggal, amount, response code) melalui dialog rekonsiliasi; setiap baris dicocokkan ke tabel transaksi QRIS berdasarkan kombinasi RRN + tanggal transaksi + amount + tipe + settle ID — jika cocok, status transaksi ditandai "sudah direkonsiliasi &amp; cocok di kedua sisi"; jika tidak ditemukan pasangannya di sisi Core, dicatat sebagai "hanya ada di sisi Jalin" (indikasi selisih). Hasil akhirnya berupa laporan Excel rekap per hari (total transaksi, total cocok, total nominal berhasil). Proses ini bersifat </w:t>
+      </w:r>
+      <w:r>
+        <w:rPr>
+          <w:b/>
+          <w:bCs/>
+        </w:rPr>
+        <w:t xml:space="preserve">manual/on-demand</w:t>
+      </w:r>
+      <w:r>
+        <w:t xml:space="preserve"> (dipicu upload user), bukan job terjadwal otomatis.</w:t>
       </w:r>
     </w:p>
     <w:p>

</xml_diff>

<commit_message>
Reorganize architecture section into 4 head groups matching the diagram
Restructure section 2 (Arsitektur Modul IBANKCORE) into four top-level
groups mirroring the four boxes in the diagram: Channel Layer, Core
Banking System (with Modul Utama, Lapisan Data, Core vs Enterprise,
and Switching-CGS as sub-headings), Internal Support Layer, and 3rd
Party Service. Update cross-references accordingly and add matching
slides (agenda cards for the 4 groups, plus a Channel Layer slide).
</commit_message>
<xml_diff>
--- a/deployments/cgs-pos/dist/materi_training_ibankcore.docx
+++ b/deployments/cgs-pos/dist/materi_training_ibankcore.docx
@@ -351,11 +351,173 @@
     </w:p>
     <w:p>
       <w:pPr>
-        <w:pStyle w:val="Heading2"/>
-        <w:spacing w:after="120" w:before="260"/>
-      </w:pPr>
-      <w:r>
-        <w:t xml:space="preserve">2.1 Modul-Modul Utama</w:t>
+        <w:spacing w:after="160" w:line="300"/>
+      </w:pPr>
+      <w:r>
+        <w:t xml:space="preserve">Gambar 2.1 tersusun dari empat kelompok besar (kotak) yang dibahas berurutan pada 2.1-2.4: </w:t>
+      </w:r>
+      <w:r>
+        <w:rPr>
+          <w:b/>
+          <w:bCs/>
+        </w:rPr>
+        <w:t xml:space="preserve">Channel Layer</w:t>
+      </w:r>
+      <w:r>
+        <w:t xml:space="preserve">, </w:t>
+      </w:r>
+      <w:r>
+        <w:rPr>
+          <w:b/>
+          <w:bCs/>
+        </w:rPr>
+        <w:t xml:space="preserve">Core Banking System</w:t>
+      </w:r>
+      <w:r>
+        <w:t xml:space="preserve">, </w:t>
+      </w:r>
+      <w:r>
+        <w:rPr>
+          <w:b/>
+          <w:bCs/>
+        </w:rPr>
+        <w:t xml:space="preserve">Internal Support Layer</w:t>
+      </w:r>
+      <w:r>
+        <w:t xml:space="preserve">, dan </w:t>
+      </w:r>
+      <w:r>
+        <w:rPr>
+          <w:b/>
+          <w:bCs/>
+        </w:rPr>
+        <w:t xml:space="preserve">3rd Party Service</w:t>
+      </w:r>
+      <w:r>
+        <w:t xml:space="preserve">.</w:t>
+      </w:r>
+    </w:p>
+    <w:p>
+      <w:pPr>
+        <w:pStyle w:val="Heading2"/>
+        <w:spacing w:after="120" w:before="260"/>
+      </w:pPr>
+      <w:r>
+        <w:t xml:space="preserve">2.1 Channel Layer</w:t>
+      </w:r>
+    </w:p>
+    <w:p>
+      <w:pPr>
+        <w:spacing w:after="160" w:line="300"/>
+      </w:pPr>
+      <w:r>
+        <w:t xml:space="preserve">Kelompok paling atas — seluruh titik masuk transaksi ke IBANKCORE:</w:t>
+      </w:r>
+    </w:p>
+    <w:p>
+      <w:pPr>
+        <w:pStyle w:val="ListParagraph"/>
+        <w:numPr>
+          <w:ilvl w:val="0"/>
+          <w:numId w:val="2"/>
+        </w:numPr>
+        <w:spacing w:after="80"/>
+      </w:pPr>
+      <w:r>
+        <w:rPr>
+          <w:b/>
+          <w:bCs/>
+        </w:rPr>
+        <w:t xml:space="preserve">BDS/AppClient</w:t>
+      </w:r>
+      <w:r>
+        <w:t xml:space="preserve">, </w:t>
+      </w:r>
+      <w:r>
+        <w:rPr>
+          <w:b/>
+          <w:bCs/>
+        </w:rPr>
+        <w:t xml:space="preserve">Mobile &amp; Internet Banking</w:t>
+      </w:r>
+      <w:r>
+        <w:t xml:space="preserve">, </w:t>
+      </w:r>
+      <w:r>
+        <w:rPr>
+          <w:b/>
+          <w:bCs/>
+        </w:rPr>
+        <w:t xml:space="preserve">E-Channel/API Gateway</w:t>
+      </w:r>
+      <w:r>
+        <w:t xml:space="preserve">, </w:t>
+      </w:r>
+      <w:r>
+        <w:rPr>
+          <w:b/>
+          <w:bCs/>
+        </w:rPr>
+        <w:t xml:space="preserve">CMS (Cash Management System)</w:t>
+      </w:r>
+      <w:r>
+        <w:t xml:space="preserve">, </w:t>
+      </w:r>
+      <w:r>
+        <w:rPr>
+          <w:b/>
+          <w:bCs/>
+        </w:rPr>
+        <w:t xml:space="preserve">ATM/EDC</w:t>
+      </w:r>
+      <w:r>
+        <w:t xml:space="preserve"> — lima kanal yang membawa transaksi masuk ke Core Banking System (2.2) dan sekaligus bisa menerima respons balik (koneksi dua arah).</w:t>
+      </w:r>
+    </w:p>
+    <w:p>
+      <w:pPr>
+        <w:pStyle w:val="ListParagraph"/>
+        <w:numPr>
+          <w:ilvl w:val="0"/>
+          <w:numId w:val="2"/>
+        </w:numPr>
+        <w:spacing w:after="80"/>
+      </w:pPr>
+      <w:r>
+        <w:rPr>
+          <w:b/>
+          <w:bCs/>
+        </w:rPr>
+        <w:t xml:space="preserve">CMS</w:t>
+      </w:r>
+      <w:r>
+        <w:t xml:space="preserve"> di sini adalah kanal digital untuk institusi/korporat (lihat 2.4 &amp; Bagian 7.6) — berbeda dari modul internal "Kas &amp; Vault" (2.2).</w:t>
+      </w:r>
+    </w:p>
+    <w:p>
+      <w:pPr>
+        <w:pStyle w:val="Heading2"/>
+        <w:spacing w:after="120" w:before="260"/>
+      </w:pPr>
+      <w:r>
+        <w:t xml:space="preserve">2.2 Core Banking System</w:t>
+      </w:r>
+    </w:p>
+    <w:p>
+      <w:pPr>
+        <w:spacing w:after="160" w:line="300"/>
+      </w:pPr>
+      <w:r>
+        <w:t xml:space="preserve">Kelompok tengah (envelope terbesar) — mesin transaksi &amp; produk perbankan itu sendiri, mencakup modul bisnis, lapisan data, dan aplikasi penyusunnya.</w:t>
+      </w:r>
+    </w:p>
+    <w:p>
+      <w:pPr>
+        <w:pStyle w:val="Heading3"/>
+        <w:spacing w:after="100" w:before="200"/>
+      </w:pPr>
+      <w:r>
+        <w:t xml:space="preserve">2.2.1 Modul-Modul Utama</w:t>
       </w:r>
     </w:p>
     <w:tbl>
@@ -632,11 +794,11 @@
     <w:p/>
     <w:p>
       <w:pPr>
-        <w:pStyle w:val="Heading2"/>
-        <w:spacing w:after="120" w:before="260"/>
-      </w:pPr>
-      <w:r>
-        <w:t xml:space="preserve">2.2 Lapisan Data</w:t>
+        <w:pStyle w:val="Heading3"/>
+        <w:spacing w:after="100" w:before="200"/>
+      </w:pPr>
+      <w:r>
+        <w:t xml:space="preserve">2.2.2 Lapisan Data</w:t>
       </w:r>
     </w:p>
     <w:p>
@@ -649,28 +811,11 @@
     </w:p>
     <w:p>
       <w:pPr>
-        <w:pStyle w:val="Heading2"/>
-        <w:spacing w:after="120" w:before="260"/>
-      </w:pPr>
-      <w:r>
-        <w:t xml:space="preserve">2.3 Kanal &amp; Sistem Sekitar</w:t>
-      </w:r>
-    </w:p>
-    <w:p>
-      <w:pPr>
-        <w:spacing w:after="160" w:line="300"/>
-      </w:pPr>
-      <w:r>
-        <w:t xml:space="preserve">Transaksi dapat masuk melalui berbagai kanal (teller/cabang, ATM/EDC, mobile &amp; internet banking, maupun API gateway). Di sisi hilir, IBANKCORE terhubung dengan kebutuhan pelaporan regulator (OJK/BI) serta kebutuhan audit eksternal.</w:t>
-      </w:r>
-    </w:p>
-    <w:p>
-      <w:pPr>
-        <w:pStyle w:val="Heading2"/>
-        <w:spacing w:after="120" w:before="260"/>
-      </w:pPr>
-      <w:r>
-        <w:t xml:space="preserve">2.4 Aplikasi Core vs Enterprise</w:t>
+        <w:pStyle w:val="Heading3"/>
+        <w:spacing w:after="100" w:before="200"/>
+      </w:pPr>
+      <w:r>
+        <w:t xml:space="preserve">2.2.3 Aplikasi Core vs Enterprise</w:t>
       </w:r>
     </w:p>
     <w:p>
@@ -776,19 +921,19 @@
     </w:p>
     <w:p>
       <w:pPr>
-        <w:pStyle w:val="Heading2"/>
-        <w:spacing w:after="120" w:before="260"/>
-      </w:pPr>
-      <w:r>
-        <w:t xml:space="preserve">2.5 Aplikasi Ketiga: Switching (switching-cgs)</w:t>
-      </w:r>
-    </w:p>
-    <w:p>
-      <w:pPr>
-        <w:spacing w:after="160" w:line="300"/>
-      </w:pPr>
-      <w:r>
-        <w:t xml:space="preserve">Selain core dan enterprise (Bagian 2.4), pada deployment PT Pos terdapat </w:t>
+        <w:pStyle w:val="Heading3"/>
+        <w:spacing w:after="100" w:before="200"/>
+      </w:pPr>
+      <w:r>
+        <w:t xml:space="preserve">2.2.4 Aplikasi Ketiga: Switching (switching-cgs)</w:t>
+      </w:r>
+    </w:p>
+    <w:p>
+      <w:pPr>
+        <w:spacing w:after="160" w:line="300"/>
+      </w:pPr>
+      <w:r>
+        <w:t xml:space="preserve">Selain core dan enterprise (2.2.3), pada deployment PT Pos terdapat </w:t>
       </w:r>
       <w:r>
         <w:rPr>
@@ -818,7 +963,7 @@
         <w:t xml:space="preserve">di dalam</w:t>
       </w:r>
       <w:r>
-        <w:t xml:space="preserve"> envelope IBANKCORE, sejajar modul lain — meski gaya visualnya tetap dibedakan (gold, garis putus-putus) untuk menandakan akses langsungnya ke database.</w:t>
+        <w:t xml:space="preserve"> envelope Core Banking System, sejajar modul lain — meski gaya visualnya tetap dibedakan (gold, garis putus-putus) untuk menandakan akses langsungnya ke database.</w:t>
       </w:r>
     </w:p>
     <w:p>
@@ -927,15 +1072,168 @@
         <w:spacing w:after="120" w:before="260"/>
       </w:pPr>
       <w:r>
-        <w:t xml:space="preserve">2.6 3rd Party Service</w:t>
-      </w:r>
-    </w:p>
-    <w:p>
-      <w:pPr>
-        <w:spacing w:after="160" w:line="300"/>
-      </w:pPr>
-      <w:r>
-        <w:t xml:space="preserve">Di sisi kanan Gambar 2.1, IBANKCORE terhubung ke sejumlah penyedia layanan pihak ketiga melalui satu jalur koneksi dua arah (bidirectional) — merepresentasikan bahwa integrasi ke masing-masing pihak ketiga pada akhirnya bermuara pada satu boundary yang sama di sisi IBANKCORE, meski secara teknis tiap pihak ketiga punya kontrak/protokol integrasinya sendiri.</w:t>
+        <w:t xml:space="preserve">2.3 Internal Support Layer</w:t>
+      </w:r>
+    </w:p>
+    <w:p>
+      <w:pPr>
+        <w:spacing w:after="160" w:line="300"/>
+      </w:pPr>
+      <w:r>
+        <w:t xml:space="preserve">Kelompok ketiga (di bawah envelope Core Banking System) — kumpulan layanan pendukung internal yang beroperasi di sekitar (bukan di dalam) database Core, masing-masing independen satu sama lain:</w:t>
+      </w:r>
+    </w:p>
+    <w:p>
+      <w:pPr>
+        <w:pStyle w:val="ListParagraph"/>
+        <w:numPr>
+          <w:ilvl w:val="0"/>
+          <w:numId w:val="2"/>
+        </w:numPr>
+        <w:spacing w:after="80"/>
+      </w:pPr>
+      <w:r>
+        <w:rPr>
+          <w:b/>
+          <w:bCs/>
+        </w:rPr>
+        <w:t xml:space="preserve">Feeder SAP</w:t>
+      </w:r>
+      <w:r>
+        <w:t xml:space="preserve"> — mengambil (pull) data akuntansi dari database Core untuk dikirim ke sistem SAP eksternal (detail mekanisme pull-nya di Bagian 4.3 &amp; 7.4).</w:t>
+      </w:r>
+    </w:p>
+    <w:p>
+      <w:pPr>
+        <w:pStyle w:val="ListParagraph"/>
+        <w:numPr>
+          <w:ilvl w:val="0"/>
+          <w:numId w:val="2"/>
+        </w:numPr>
+        <w:spacing w:after="80"/>
+      </w:pPr>
+      <w:r>
+        <w:rPr>
+          <w:b/>
+          <w:bCs/>
+        </w:rPr>
+        <w:t xml:space="preserve">Cut-off &amp; Cleansing Service</w:t>
+      </w:r>
+      <w:r>
+        <w:t xml:space="preserve"> — layanan yang menyiapkan/membersihkan data pada titik cut-off (mis. akhir hari), sejalan dengan proses Batch EOD/BOD yang telah dibahas (Bagian 10.1), sebelum data dikonsumsi oleh layanan hilir seperti DWH atau Reporting Service.</w:t>
+      </w:r>
+    </w:p>
+    <w:p>
+      <w:pPr>
+        <w:pStyle w:val="ListParagraph"/>
+        <w:numPr>
+          <w:ilvl w:val="0"/>
+          <w:numId w:val="2"/>
+        </w:numPr>
+        <w:spacing w:after="80"/>
+      </w:pPr>
+      <w:r>
+        <w:rPr>
+          <w:b/>
+          <w:bCs/>
+        </w:rPr>
+        <w:t xml:space="preserve">DWH (Data Warehouse)</w:t>
+      </w:r>
+      <w:r>
+        <w:t xml:space="preserve"> — gudang data yang menampung hasil olahan/agregasi data Core untuk kebutuhan analitik, menjadi sumber data bagi Dashboard.</w:t>
+      </w:r>
+    </w:p>
+    <w:p>
+      <w:pPr>
+        <w:pStyle w:val="ListParagraph"/>
+        <w:numPr>
+          <w:ilvl w:val="0"/>
+          <w:numId w:val="2"/>
+        </w:numPr>
+        <w:spacing w:after="80"/>
+      </w:pPr>
+      <w:r>
+        <w:rPr>
+          <w:b/>
+          <w:bCs/>
+        </w:rPr>
+        <w:t xml:space="preserve">Reporting Service</w:t>
+      </w:r>
+      <w:r>
+        <w:t xml:space="preserve"> — layanan yang menyusun laporan, termasuk pelaporan berkala ke regulator OJK/BI (Bagian 7.1).</w:t>
+      </w:r>
+    </w:p>
+    <w:p>
+      <w:pPr>
+        <w:spacing w:after="160" w:line="300"/>
+      </w:pPr>
+      <w:r>
+        <w:t xml:space="preserve">Keempat layanan ini bermuara ke tiga tujuan akhir: </w:t>
+      </w:r>
+      <w:r>
+        <w:rPr>
+          <w:b/>
+          <w:bCs/>
+        </w:rPr>
+        <w:t xml:space="preserve">SAP</w:t>
+      </w:r>
+      <w:r>
+        <w:t xml:space="preserve"> (dari Feeder SAP), </w:t>
+      </w:r>
+      <w:r>
+        <w:rPr>
+          <w:b/>
+          <w:bCs/>
+        </w:rPr>
+        <w:t xml:space="preserve">Regulator OJK/BI Reporting</w:t>
+      </w:r>
+      <w:r>
+        <w:t xml:space="preserve"> (dari Internal Support Layer secara umum, terutama Reporting Service), dan </w:t>
+      </w:r>
+      <w:r>
+        <w:rPr>
+          <w:b/>
+          <w:bCs/>
+        </w:rPr>
+        <w:t xml:space="preserve">Dashboard</w:t>
+      </w:r>
+      <w:r>
+        <w:t xml:space="preserve"> (dipasok dari DWH).</w:t>
+      </w:r>
+    </w:p>
+    <w:p>
+      <w:pPr>
+        <w:spacing w:after="160" w:line="300"/>
+      </w:pPr>
+      <w:r>
+        <w:t xml:space="preserve">&gt; </w:t>
+      </w:r>
+      <w:r>
+        <w:rPr>
+          <w:b/>
+          <w:bCs/>
+        </w:rPr>
+        <w:t xml:space="preserve">Catatan</w:t>
+      </w:r>
+      <w:r>
+        <w:t xml:space="preserve">: penamaan "Internal Support Layer" dipilih untuk membedakannya dari "3rd Party Service" (2.4) — layanan-layanan ini adalah komponen pendukung milik/dikelola sendiri (internal), bukan sistem pihak ketiga eksternal, meski posisinya di luar envelope Core Banking System pada diagram.</w:t>
+      </w:r>
+    </w:p>
+    <w:p>
+      <w:pPr>
+        <w:pStyle w:val="Heading2"/>
+        <w:spacing w:after="120" w:before="260"/>
+      </w:pPr>
+      <w:r>
+        <w:t xml:space="preserve">2.4 3rd Party Service</w:t>
+      </w:r>
+    </w:p>
+    <w:p>
+      <w:pPr>
+        <w:spacing w:after="160" w:line="300"/>
+      </w:pPr>
+      <w:r>
+        <w:t xml:space="preserve">Kelompok keempat (di sisi kanan Gambar 2.1) — penyedia layanan pihak ketiga yang terhubung ke IBANKCORE melalui satu jalur koneksi dua arah (bidirectional), merepresentasikan bahwa integrasi ke masing-masing pihak ketiga pada akhirnya bermuara pada satu boundary yang sama di sisi IBANKCORE, meski secara teknis tiap pihak ketiga punya kontrak/protokol integrasinya sendiri.</w:t>
       </w:r>
     </w:p>
     <w:p>
@@ -975,7 +1273,7 @@
         <w:t xml:space="preserve">Jalin (QRIS)</w:t>
       </w:r>
       <w:r>
-        <w:t xml:space="preserve"> — penyedia switching QRIS; pemrosesannya ditangani oleh service `jalin` pada aplikasi switching-cgs (Bagian 2.5 &amp; 7.2), termasuk proses rekonsiliasi manual berbasis file dari Jalin (Bagian 7.2).</w:t>
+        <w:t xml:space="preserve"> — penyedia switching QRIS; pemrosesannya ditangani oleh service `jalin` pada aplikasi switching-cgs (2.2.4 &amp; Bagian 7.2), termasuk proses rekonsiliasi manual berbasis file dari Jalin (Bagian 7.2).</w:t>
       </w:r>
     </w:p>
     <w:p>
@@ -1014,159 +1312,6 @@
       </w:r>
       <w:r>
         <w:t xml:space="preserve">: pengelompokan "3rd Party Service" ini menggambarkan pihak eksternal yang sudah dibahas detailnya di bagian lain — bagian ini hanya menyatukan gambaran besarnya dalam satu diagram arsitektur.</w:t>
-      </w:r>
-    </w:p>
-    <w:p>
-      <w:pPr>
-        <w:pStyle w:val="Heading2"/>
-        <w:spacing w:after="120" w:before="260"/>
-      </w:pPr>
-      <w:r>
-        <w:t xml:space="preserve">2.7 Internal Support Layer</w:t>
-      </w:r>
-    </w:p>
-    <w:p>
-      <w:pPr>
-        <w:spacing w:after="160" w:line="300"/>
-      </w:pPr>
-      <w:r>
-        <w:t xml:space="preserve">Di bagian bawah Gambar 2.1, terdapat kumpulan layanan pendukung internal yang beroperasi di sekitar (bukan di dalam) database Core, masing-masing independen satu sama lain:</w:t>
-      </w:r>
-    </w:p>
-    <w:p>
-      <w:pPr>
-        <w:pStyle w:val="ListParagraph"/>
-        <w:numPr>
-          <w:ilvl w:val="0"/>
-          <w:numId w:val="2"/>
-        </w:numPr>
-        <w:spacing w:after="80"/>
-      </w:pPr>
-      <w:r>
-        <w:rPr>
-          <w:b/>
-          <w:bCs/>
-        </w:rPr>
-        <w:t xml:space="preserve">Feeder SAP</w:t>
-      </w:r>
-      <w:r>
-        <w:t xml:space="preserve"> — mengambil (pull) data akuntansi dari database Core untuk dikirim ke sistem SAP eksternal (detail mekanisme pull-nya di Bagian 4.3 &amp; 7.4).</w:t>
-      </w:r>
-    </w:p>
-    <w:p>
-      <w:pPr>
-        <w:pStyle w:val="ListParagraph"/>
-        <w:numPr>
-          <w:ilvl w:val="0"/>
-          <w:numId w:val="2"/>
-        </w:numPr>
-        <w:spacing w:after="80"/>
-      </w:pPr>
-      <w:r>
-        <w:rPr>
-          <w:b/>
-          <w:bCs/>
-        </w:rPr>
-        <w:t xml:space="preserve">Cut-off &amp; Cleansing Service</w:t>
-      </w:r>
-      <w:r>
-        <w:t xml:space="preserve"> — layanan yang menyiapkan/membersihkan data pada titik cut-off (mis. akhir hari), sejalan dengan proses Batch EOD/BOD yang telah dibahas (Bagian 10.1), sebelum data dikonsumsi oleh layanan hilir seperti DWH atau Reporting Service.</w:t>
-      </w:r>
-    </w:p>
-    <w:p>
-      <w:pPr>
-        <w:pStyle w:val="ListParagraph"/>
-        <w:numPr>
-          <w:ilvl w:val="0"/>
-          <w:numId w:val="2"/>
-        </w:numPr>
-        <w:spacing w:after="80"/>
-      </w:pPr>
-      <w:r>
-        <w:rPr>
-          <w:b/>
-          <w:bCs/>
-        </w:rPr>
-        <w:t xml:space="preserve">DWH (Data Warehouse)</w:t>
-      </w:r>
-      <w:r>
-        <w:t xml:space="preserve"> — gudang data yang menampung hasil olahan/agregasi data Core untuk kebutuhan analitik, menjadi sumber data bagi Dashboard.</w:t>
-      </w:r>
-    </w:p>
-    <w:p>
-      <w:pPr>
-        <w:pStyle w:val="ListParagraph"/>
-        <w:numPr>
-          <w:ilvl w:val="0"/>
-          <w:numId w:val="2"/>
-        </w:numPr>
-        <w:spacing w:after="80"/>
-      </w:pPr>
-      <w:r>
-        <w:rPr>
-          <w:b/>
-          <w:bCs/>
-        </w:rPr>
-        <w:t xml:space="preserve">Reporting Service</w:t>
-      </w:r>
-      <w:r>
-        <w:t xml:space="preserve"> — layanan yang menyusun laporan, termasuk pelaporan berkala ke regulator OJK/BI (Bagian 7.1).</w:t>
-      </w:r>
-    </w:p>
-    <w:p>
-      <w:pPr>
-        <w:spacing w:after="160" w:line="300"/>
-      </w:pPr>
-      <w:r>
-        <w:t xml:space="preserve">Keempat layanan ini bermuara ke tiga tujuan akhir: </w:t>
-      </w:r>
-      <w:r>
-        <w:rPr>
-          <w:b/>
-          <w:bCs/>
-        </w:rPr>
-        <w:t xml:space="preserve">SAP</w:t>
-      </w:r>
-      <w:r>
-        <w:t xml:space="preserve"> (dari Feeder SAP), </w:t>
-      </w:r>
-      <w:r>
-        <w:rPr>
-          <w:b/>
-          <w:bCs/>
-        </w:rPr>
-        <w:t xml:space="preserve">Regulator OJK/BI Reporting</w:t>
-      </w:r>
-      <w:r>
-        <w:t xml:space="preserve"> (dari Internal Support Layer secara umum, terutama Reporting Service), dan </w:t>
-      </w:r>
-      <w:r>
-        <w:rPr>
-          <w:b/>
-          <w:bCs/>
-        </w:rPr>
-        <w:t xml:space="preserve">Dashboard</w:t>
-      </w:r>
-      <w:r>
-        <w:t xml:space="preserve"> (dipasok dari DWH).</w:t>
-      </w:r>
-    </w:p>
-    <w:p>
-      <w:pPr>
-        <w:spacing w:after="160" w:line="300"/>
-      </w:pPr>
-      <w:r>
-        <w:t xml:space="preserve">&gt; </w:t>
-      </w:r>
-      <w:r>
-        <w:rPr>
-          <w:b/>
-          <w:bCs/>
-        </w:rPr>
-        <w:t xml:space="preserve">Catatan</w:t>
-      </w:r>
-      <w:r>
-        <w:t xml:space="preserve">: penamaan "Internal Support Layer" dipilih untuk membedakannya dari "3rd Party Service" (Bagian 2.6) — layanan-layanan ini adalah komponen pendukung milik/dikelola sendiri (internal), bukan sistem pihak ketiga eksternal, meski posisinya di luar envelope IBANKCORE pada diagram.</w:t>
       </w:r>
     </w:p>
     <w:p>
@@ -2426,7 +2571,7 @@
         <w:t xml:space="preserve">QRIS</w:t>
       </w:r>
       <w:r>
-        <w:t xml:space="preserve"> — kanal pembayaran berbasis kode QR standar nasional; transaksi QRIS masuk melalui integrasi channel pihak ketiga dan diselesaikan (settlement) ke rekening tujuan melalui proses tersendiri. Pemrosesan QRIS ditangani oleh service `jalin` pada aplikasi switching-cgs (Bagian 2.5), dengan pola akses langsung ke database Core yang sama seperti switching pembayaran lainnya.</w:t>
+        <w:t xml:space="preserve"> — kanal pembayaran berbasis kode QR standar nasional; transaksi QRIS masuk melalui integrasi channel pihak ketiga dan diselesaikan (settlement) ke rekening tujuan melalui proses tersendiri. Pemrosesan QRIS ditangani oleh service `jalin` pada aplikasi switching-cgs (Bagian 2.2.4), dengan pola akses langsung ke database Core yang sama seperti switching pembayaran lainnya.</w:t>
       </w:r>
     </w:p>
     <w:p>
@@ -2527,7 +2672,7 @@
         <w:spacing w:after="160" w:line="300"/>
       </w:pPr>
       <w:r>
-        <w:t xml:space="preserve">Payment Switching (switching pembayaran antar kanal/ATM-EDC) ditangani oleh aplikasi switching-cgs (Bagian 2.5) dan memiliki </w:t>
+        <w:t xml:space="preserve">Payment Switching (switching pembayaran antar kanal/ATM-EDC) ditangani oleh aplikasi switching-cgs (Bagian 2.2.4) dan memiliki </w:t>
       </w:r>
       <w:r>
         <w:rPr>

</xml_diff>